<commit_message>
Add live dashboard link to the project report
</commit_message>
<xml_diff>
--- a/report/project_report.docx
+++ b/report/project_report.docx
@@ -4637,6 +4637,45 @@
     </w:p>
     <w:p>
       <w:pPr>
+        <w:bidi/>
+        <w:spacing w:after="80" w:before="0" w:line="276" w:lineRule="auto"/>
+      </w:pPr>
+      <w:r>
+        <w:rPr>
+          <w:rFonts w:ascii="Times New Roman" w:hAnsi="Times New Roman" w:cs="Times New Roman"/>
+          <w:b/>
+          <w:bCs/>
+          <w:sz w:val="24"/>
+          <w:szCs w:val="24"/>
+          <w:rtl/>
+        </w:rPr>
+        <w:t>رابط الداشبورد:</w:t>
+      </w:r>
+      <w:r>
+        <w:rPr>
+          <w:rFonts w:ascii="Times New Roman" w:hAnsi="Times New Roman" w:cs="Times New Roman"/>
+          <w:b w:val="0"/>
+          <w:sz w:val="24"/>
+          <w:szCs w:val="24"/>
+          <w:rtl/>
+        </w:rPr>
+        <w:t xml:space="preserve"> </w:t>
+      </w:r>
+      <w:hyperlink r:id="rId13">
+        <w:r>
+          <w:rPr>
+            <w:rFonts w:ascii="Times New Roman" w:hAnsi="Times New Roman" w:cs="Times New Roman"/>
+            <w:color w:val="0284C7"/>
+            <w:sz w:val="24"/>
+            <w:szCs w:val="24"/>
+            <w:u w:val="single"/>
+          </w:rPr>
+          <w:t xml:space="preserve">hayasaleh97.github.io/npo-governorate-gap-analysis/outputs/dashboard.html</w:t>
+        </w:r>
+      </w:hyperlink>
+    </w:p>
+    <w:p>
+      <w:pPr>
         <w:keepNext/>
         <w:bidi/>
         <w:spacing w:after="20" w:before="0" w:line="276" w:lineRule="auto"/>
@@ -4658,7 +4697,7 @@
                     <pic:cNvPicPr/>
                   </pic:nvPicPr>
                   <pic:blipFill>
-                    <a:blip r:embed="rId13"/>
+                    <a:blip r:embed="rId14"/>
                     <a:stretch>
                       <a:fillRect/>
                     </a:stretch>
@@ -4718,7 +4757,7 @@
                     <pic:cNvPicPr/>
                   </pic:nvPicPr>
                   <pic:blipFill>
-                    <a:blip r:embed="rId14"/>
+                    <a:blip r:embed="rId15"/>
                     <a:stretch>
                       <a:fillRect/>
                     </a:stretch>
@@ -4778,7 +4817,7 @@
                     <pic:cNvPicPr/>
                   </pic:nvPicPr>
                   <pic:blipFill>
-                    <a:blip r:embed="rId15"/>
+                    <a:blip r:embed="rId16"/>
                     <a:stretch>
                       <a:fillRect/>
                     </a:stretch>
@@ -5065,7 +5104,7 @@
         </w:rPr>
         <w:t xml:space="preserve">1. المركز الوطني لتنمية القطاع غير الربحي، سجل الكيانات غير الربحية (13 ملفًا حسب المنطقة)، منصة البيانات المفتوحة الوطنية. روابط الملفات في README. </w:t>
       </w:r>
-      <w:hyperlink r:id="rId16">
+      <w:hyperlink r:id="rId17">
         <w:r>
           <w:rPr>
             <w:rFonts w:ascii="Times New Roman" w:hAnsi="Times New Roman" w:cs="Times New Roman"/>
@@ -5093,7 +5132,7 @@
         </w:rPr>
         <w:t xml:space="preserve">2. الهيئة العامة للإحصاء، تعداد السكان 2022، عبر City Population: Saudi Arabia, Administrative Division. </w:t>
       </w:r>
-      <w:hyperlink r:id="rId17">
+      <w:hyperlink r:id="rId18">
         <w:r>
           <w:rPr>
             <w:rFonts w:ascii="Times New Roman" w:hAnsi="Times New Roman" w:cs="Times New Roman"/>
@@ -5121,7 +5160,7 @@
         </w:rPr>
         <w:t xml:space="preserve">3. geoBoundaries: حدود SAU ADM2 وADM1 (OpenStreetMap)، الترخيص CC BY-SA 2.0 وODbL. </w:t>
       </w:r>
-      <w:hyperlink r:id="rId18">
+      <w:hyperlink r:id="rId19">
         <w:r>
           <w:rPr>
             <w:rFonts w:ascii="Times New Roman" w:hAnsi="Times New Roman" w:cs="Times New Roman"/>
@@ -5135,7 +5174,7 @@
       </w:hyperlink>
     </w:p>
     <w:sectPr>
-      <w:footerReference w:type="default" r:id="rId19"/>
+      <w:footerReference w:type="default" r:id="rId20"/>
       <w:pgSz w:w="11906" w:h="16838"/>
       <w:pgMar w:top="907" w:right="1077" w:bottom="850" w:left="1077" w:header="720" w:footer="720" w:gutter="0"/>
       <w:cols w:space="720"/>

</xml_diff>